<commit_message>
Sprint 4 - Cart module implemented with add, update, remove and total price
</commit_message>
<xml_diff>
--- a/Project_related_questions.docx
+++ b/Project_related_questions.docx
@@ -21,6 +21,7 @@
           <w:rFonts w:eastAsia="Times New Roman" w:cstheme="minorHAnsi"/>
           <w:b/>
           <w:bCs/>
+          <w:noProof/>
           <w:kern w:val="36"/>
           <w:sz w:val="24"/>
           <w:szCs w:val="24"/>
@@ -79,6 +80,7 @@
           <w:rFonts w:eastAsia="Times New Roman" w:cstheme="minorHAnsi"/>
           <w:b/>
           <w:bCs/>
+          <w:noProof/>
           <w:kern w:val="36"/>
           <w:sz w:val="24"/>
           <w:szCs w:val="24"/>
@@ -5617,8 +5619,6 @@
         </w:rPr>
         <w:t>Example:</w:t>
       </w:r>
-      <w:bookmarkStart w:id="0" w:name="_GoBack"/>
-      <w:bookmarkEnd w:id="0"/>
     </w:p>
     <w:p>
       <w:pPr>
@@ -5711,7 +5711,657 @@
       </w:pPr>
     </w:p>
     <w:p/>
-    <w:p/>
+    <w:p>
+      <w:pPr>
+        <w:rPr>
+          <w:rFonts w:cstheme="minorHAnsi"/>
+          <w:b/>
+          <w:sz w:val="24"/>
+          <w:szCs w:val="24"/>
+        </w:rPr>
+      </w:pPr>
+      <w:r>
+        <w:rPr>
+          <w:rFonts w:cstheme="minorHAnsi"/>
+          <w:b/>
+          <w:sz w:val="24"/>
+          <w:szCs w:val="24"/>
+        </w:rPr>
+        <w:t>13. Why was the Product Update API returning success even wh</w:t>
+      </w:r>
+      <w:r>
+        <w:rPr>
+          <w:rFonts w:cstheme="minorHAnsi"/>
+          <w:b/>
+          <w:sz w:val="24"/>
+          <w:szCs w:val="24"/>
+        </w:rPr>
+        <w:t>en the product ID did not exist</w:t>
+      </w:r>
+      <w:r>
+        <w:rPr>
+          <w:rFonts w:cstheme="minorHAnsi"/>
+          <w:b/>
+          <w:sz w:val="24"/>
+          <w:szCs w:val="24"/>
+        </w:rPr>
+        <w:t>?</w:t>
+      </w:r>
+    </w:p>
+    <w:p>
+      <w:pPr>
+        <w:rPr>
+          <w:rFonts w:cstheme="minorHAnsi"/>
+          <w:b/>
+          <w:sz w:val="24"/>
+          <w:szCs w:val="24"/>
+        </w:rPr>
+      </w:pPr>
+      <w:r>
+        <w:rPr>
+          <w:rFonts w:cstheme="minorHAnsi"/>
+          <w:b/>
+          <w:sz w:val="24"/>
+          <w:szCs w:val="24"/>
+        </w:rPr>
+        <w:drawing>
+          <wp:inline distT="0" distB="0" distL="0" distR="0" wp14:anchorId="25C38E4E" wp14:editId="46C146EF">
+            <wp:extent cx="5731510" cy="3227648"/>
+            <wp:effectExtent l="0" t="0" r="2540" b="0"/>
+            <wp:docPr id="3" name="Picture 3"/>
+            <wp:cNvGraphicFramePr>
+              <a:graphicFrameLocks xmlns:a="http://schemas.openxmlformats.org/drawingml/2006/main" noChangeAspect="1"/>
+            </wp:cNvGraphicFramePr>
+            <a:graphic xmlns:a="http://schemas.openxmlformats.org/drawingml/2006/main">
+              <a:graphicData uri="http://schemas.openxmlformats.org/drawingml/2006/picture">
+                <pic:pic xmlns:pic="http://schemas.openxmlformats.org/drawingml/2006/picture">
+                  <pic:nvPicPr>
+                    <pic:cNvPr id="0" name=""/>
+                    <pic:cNvPicPr/>
+                  </pic:nvPicPr>
+                  <pic:blipFill>
+                    <a:blip r:embed="rId8"/>
+                    <a:stretch>
+                      <a:fillRect/>
+                    </a:stretch>
+                  </pic:blipFill>
+                  <pic:spPr>
+                    <a:xfrm>
+                      <a:off x="0" y="0"/>
+                      <a:ext cx="5731510" cy="3227648"/>
+                    </a:xfrm>
+                    <a:prstGeom prst="rect">
+                      <a:avLst/>
+                    </a:prstGeom>
+                  </pic:spPr>
+                </pic:pic>
+              </a:graphicData>
+            </a:graphic>
+          </wp:inline>
+        </w:drawing>
+      </w:r>
+    </w:p>
+    <w:p>
+      <w:pPr>
+        <w:rPr>
+          <w:rFonts w:cstheme="minorHAnsi"/>
+          <w:sz w:val="24"/>
+          <w:szCs w:val="24"/>
+        </w:rPr>
+      </w:pPr>
+      <w:r>
+        <w:rPr>
+          <w:rFonts w:cstheme="minorHAnsi"/>
+          <w:sz w:val="24"/>
+          <w:szCs w:val="24"/>
+        </w:rPr>
+        <w:t xml:space="preserve">Now, the API correctly returns 404 </w:t>
+      </w:r>
+      <w:proofErr w:type="gramStart"/>
+      <w:r>
+        <w:rPr>
+          <w:rFonts w:cstheme="minorHAnsi"/>
+          <w:sz w:val="24"/>
+          <w:szCs w:val="24"/>
+        </w:rPr>
+        <w:t>error</w:t>
+      </w:r>
+      <w:proofErr w:type="gramEnd"/>
+      <w:r>
+        <w:rPr>
+          <w:rFonts w:cstheme="minorHAnsi"/>
+          <w:sz w:val="24"/>
+          <w:szCs w:val="24"/>
+        </w:rPr>
+        <w:t>.</w:t>
+      </w:r>
+    </w:p>
+    <w:p>
+      <w:pPr>
+        <w:rPr>
+          <w:rFonts w:cstheme="minorHAnsi"/>
+          <w:b/>
+          <w:sz w:val="24"/>
+          <w:szCs w:val="24"/>
+        </w:rPr>
+      </w:pPr>
+    </w:p>
+    <w:p>
+      <w:pPr>
+        <w:rPr>
+          <w:rFonts w:cstheme="minorHAnsi"/>
+          <w:b/>
+          <w:sz w:val="24"/>
+          <w:szCs w:val="24"/>
+        </w:rPr>
+      </w:pPr>
+    </w:p>
+    <w:p>
+      <w:pPr>
+        <w:rPr>
+          <w:rFonts w:cstheme="minorHAnsi"/>
+          <w:b/>
+          <w:sz w:val="24"/>
+          <w:szCs w:val="24"/>
+        </w:rPr>
+      </w:pPr>
+    </w:p>
+    <w:p>
+      <w:pPr>
+        <w:rPr>
+          <w:rFonts w:cstheme="minorHAnsi"/>
+          <w:b/>
+          <w:sz w:val="24"/>
+          <w:szCs w:val="24"/>
+        </w:rPr>
+      </w:pPr>
+    </w:p>
+    <w:p>
+      <w:pPr>
+        <w:rPr>
+          <w:rFonts w:cstheme="minorHAnsi"/>
+          <w:b/>
+          <w:sz w:val="24"/>
+          <w:szCs w:val="24"/>
+        </w:rPr>
+      </w:pPr>
+    </w:p>
+    <w:p>
+      <w:pPr>
+        <w:rPr>
+          <w:rFonts w:cstheme="minorHAnsi"/>
+          <w:b/>
+          <w:sz w:val="24"/>
+          <w:szCs w:val="24"/>
+        </w:rPr>
+      </w:pPr>
+      <w:r>
+        <w:rPr>
+          <w:rFonts w:cstheme="minorHAnsi"/>
+          <w:b/>
+          <w:sz w:val="24"/>
+          <w:szCs w:val="24"/>
+        </w:rPr>
+        <w:lastRenderedPageBreak/>
+        <w:t xml:space="preserve">14. </w:t>
+      </w:r>
+      <w:r>
+        <w:rPr>
+          <w:rFonts w:cstheme="minorHAnsi"/>
+          <w:b/>
+          <w:sz w:val="24"/>
+          <w:szCs w:val="24"/>
+        </w:rPr>
+        <w:t>Why was Delete API returning success even if the product did not exist?</w:t>
+      </w:r>
+    </w:p>
+    <w:p>
+      <w:pPr>
+        <w:rPr>
+          <w:rFonts w:cstheme="minorHAnsi"/>
+          <w:b/>
+          <w:sz w:val="24"/>
+          <w:szCs w:val="24"/>
+        </w:rPr>
+      </w:pPr>
+      <w:r>
+        <w:rPr>
+          <w:rFonts w:cstheme="minorHAnsi"/>
+          <w:b/>
+          <w:sz w:val="24"/>
+          <w:szCs w:val="24"/>
+        </w:rPr>
+        <w:drawing>
+          <wp:inline distT="0" distB="0" distL="0" distR="0" wp14:anchorId="5AAEC981" wp14:editId="7255C629">
+            <wp:extent cx="5731510" cy="2392416"/>
+            <wp:effectExtent l="0" t="0" r="2540" b="8255"/>
+            <wp:docPr id="5" name="Picture 5"/>
+            <wp:cNvGraphicFramePr>
+              <a:graphicFrameLocks xmlns:a="http://schemas.openxmlformats.org/drawingml/2006/main" noChangeAspect="1"/>
+            </wp:cNvGraphicFramePr>
+            <a:graphic xmlns:a="http://schemas.openxmlformats.org/drawingml/2006/main">
+              <a:graphicData uri="http://schemas.openxmlformats.org/drawingml/2006/picture">
+                <pic:pic xmlns:pic="http://schemas.openxmlformats.org/drawingml/2006/picture">
+                  <pic:nvPicPr>
+                    <pic:cNvPr id="0" name=""/>
+                    <pic:cNvPicPr/>
+                  </pic:nvPicPr>
+                  <pic:blipFill>
+                    <a:blip r:embed="rId9"/>
+                    <a:stretch>
+                      <a:fillRect/>
+                    </a:stretch>
+                  </pic:blipFill>
+                  <pic:spPr>
+                    <a:xfrm>
+                      <a:off x="0" y="0"/>
+                      <a:ext cx="5731510" cy="2392416"/>
+                    </a:xfrm>
+                    <a:prstGeom prst="rect">
+                      <a:avLst/>
+                    </a:prstGeom>
+                  </pic:spPr>
+                </pic:pic>
+              </a:graphicData>
+            </a:graphic>
+          </wp:inline>
+        </w:drawing>
+      </w:r>
+    </w:p>
+    <w:p>
+      <w:pPr>
+        <w:rPr>
+          <w:rFonts w:cstheme="minorHAnsi"/>
+          <w:b/>
+          <w:sz w:val="24"/>
+          <w:szCs w:val="24"/>
+        </w:rPr>
+      </w:pPr>
+    </w:p>
+    <w:p>
+      <w:pPr>
+        <w:rPr>
+          <w:rFonts w:cstheme="minorHAnsi"/>
+          <w:b/>
+          <w:sz w:val="24"/>
+          <w:szCs w:val="24"/>
+        </w:rPr>
+      </w:pPr>
+      <w:r>
+        <w:rPr>
+          <w:rFonts w:cstheme="minorHAnsi"/>
+          <w:b/>
+          <w:sz w:val="24"/>
+          <w:szCs w:val="24"/>
+        </w:rPr>
+        <w:t>15</w:t>
+      </w:r>
+      <w:r>
+        <w:rPr>
+          <w:rFonts w:cstheme="minorHAnsi"/>
+          <w:b/>
+          <w:sz w:val="24"/>
+          <w:szCs w:val="24"/>
+        </w:rPr>
+        <w:t xml:space="preserve">. Why was </w:t>
+      </w:r>
+      <w:r>
+        <w:rPr>
+          <w:rStyle w:val="HTMLCode"/>
+          <w:rFonts w:asciiTheme="minorHAnsi" w:eastAsiaTheme="minorHAnsi" w:hAnsiTheme="minorHAnsi" w:cstheme="minorHAnsi"/>
+          <w:b/>
+          <w:sz w:val="24"/>
+          <w:szCs w:val="24"/>
+        </w:rPr>
+        <w:t>Optional&lt;Product&gt;</w:t>
+      </w:r>
+      <w:r>
+        <w:rPr>
+          <w:rFonts w:cstheme="minorHAnsi"/>
+          <w:b/>
+          <w:sz w:val="24"/>
+          <w:szCs w:val="24"/>
+        </w:rPr>
+        <w:t xml:space="preserve"> appearing in API response?</w:t>
+      </w:r>
+    </w:p>
+    <w:p>
+      <w:pPr>
+        <w:rPr>
+          <w:rFonts w:cstheme="minorHAnsi"/>
+          <w:b/>
+          <w:sz w:val="24"/>
+          <w:szCs w:val="24"/>
+        </w:rPr>
+      </w:pPr>
+      <w:r>
+        <w:rPr>
+          <w:rFonts w:cstheme="minorHAnsi"/>
+          <w:b/>
+          <w:sz w:val="24"/>
+          <w:szCs w:val="24"/>
+        </w:rPr>
+        <w:drawing>
+          <wp:inline distT="0" distB="0" distL="0" distR="0" wp14:anchorId="7E4A29C7" wp14:editId="5367DFBF">
+            <wp:extent cx="5731510" cy="2760432"/>
+            <wp:effectExtent l="0" t="0" r="2540" b="1905"/>
+            <wp:docPr id="6" name="Picture 6"/>
+            <wp:cNvGraphicFramePr>
+              <a:graphicFrameLocks xmlns:a="http://schemas.openxmlformats.org/drawingml/2006/main" noChangeAspect="1"/>
+            </wp:cNvGraphicFramePr>
+            <a:graphic xmlns:a="http://schemas.openxmlformats.org/drawingml/2006/main">
+              <a:graphicData uri="http://schemas.openxmlformats.org/drawingml/2006/picture">
+                <pic:pic xmlns:pic="http://schemas.openxmlformats.org/drawingml/2006/picture">
+                  <pic:nvPicPr>
+                    <pic:cNvPr id="0" name=""/>
+                    <pic:cNvPicPr/>
+                  </pic:nvPicPr>
+                  <pic:blipFill>
+                    <a:blip r:embed="rId10"/>
+                    <a:stretch>
+                      <a:fillRect/>
+                    </a:stretch>
+                  </pic:blipFill>
+                  <pic:spPr>
+                    <a:xfrm>
+                      <a:off x="0" y="0"/>
+                      <a:ext cx="5731510" cy="2760432"/>
+                    </a:xfrm>
+                    <a:prstGeom prst="rect">
+                      <a:avLst/>
+                    </a:prstGeom>
+                  </pic:spPr>
+                </pic:pic>
+              </a:graphicData>
+            </a:graphic>
+          </wp:inline>
+        </w:drawing>
+      </w:r>
+    </w:p>
+    <w:p>
+      <w:pPr>
+        <w:rPr>
+          <w:rFonts w:cstheme="minorHAnsi"/>
+          <w:b/>
+          <w:sz w:val="24"/>
+          <w:szCs w:val="24"/>
+        </w:rPr>
+      </w:pPr>
+    </w:p>
+    <w:p>
+      <w:pPr>
+        <w:rPr>
+          <w:rFonts w:cstheme="minorHAnsi"/>
+          <w:b/>
+          <w:sz w:val="24"/>
+          <w:szCs w:val="24"/>
+        </w:rPr>
+      </w:pPr>
+    </w:p>
+    <w:p>
+      <w:pPr>
+        <w:rPr>
+          <w:rFonts w:cstheme="minorHAnsi"/>
+          <w:b/>
+          <w:sz w:val="24"/>
+          <w:szCs w:val="24"/>
+        </w:rPr>
+      </w:pPr>
+    </w:p>
+    <w:p>
+      <w:pPr>
+        <w:rPr>
+          <w:rFonts w:cstheme="minorHAnsi"/>
+          <w:b/>
+          <w:sz w:val="24"/>
+          <w:szCs w:val="24"/>
+        </w:rPr>
+      </w:pPr>
+    </w:p>
+    <w:p>
+      <w:pPr>
+        <w:rPr>
+          <w:rFonts w:cstheme="minorHAnsi"/>
+          <w:b/>
+          <w:sz w:val="24"/>
+          <w:szCs w:val="24"/>
+        </w:rPr>
+      </w:pPr>
+    </w:p>
+    <w:p>
+      <w:pPr>
+        <w:rPr>
+          <w:rFonts w:cstheme="minorHAnsi"/>
+          <w:b/>
+          <w:sz w:val="24"/>
+          <w:szCs w:val="24"/>
+        </w:rPr>
+      </w:pPr>
+    </w:p>
+    <w:p>
+      <w:pPr>
+        <w:rPr>
+          <w:rFonts w:cstheme="minorHAnsi"/>
+          <w:b/>
+          <w:sz w:val="24"/>
+          <w:szCs w:val="24"/>
+        </w:rPr>
+      </w:pPr>
+    </w:p>
+    <w:p>
+      <w:pPr>
+        <w:rPr>
+          <w:rFonts w:cstheme="minorHAnsi"/>
+          <w:b/>
+          <w:sz w:val="24"/>
+          <w:szCs w:val="24"/>
+        </w:rPr>
+      </w:pPr>
+      <w:r>
+        <w:rPr>
+          <w:rFonts w:cstheme="minorHAnsi"/>
+          <w:b/>
+          <w:sz w:val="24"/>
+          <w:szCs w:val="24"/>
+        </w:rPr>
+        <w:lastRenderedPageBreak/>
+        <w:t xml:space="preserve">16. Why was the Add Product API returning 403 </w:t>
+      </w:r>
+      <w:proofErr w:type="gramStart"/>
+      <w:r>
+        <w:rPr>
+          <w:rFonts w:cstheme="minorHAnsi"/>
+          <w:b/>
+          <w:sz w:val="24"/>
+          <w:szCs w:val="24"/>
+        </w:rPr>
+        <w:t>Forbidden</w:t>
+      </w:r>
+      <w:proofErr w:type="gramEnd"/>
+      <w:r>
+        <w:rPr>
+          <w:rFonts w:cstheme="minorHAnsi"/>
+          <w:b/>
+          <w:sz w:val="24"/>
+          <w:szCs w:val="24"/>
+        </w:rPr>
+        <w:t>?</w:t>
+      </w:r>
+    </w:p>
+    <w:p>
+      <w:pPr>
+        <w:rPr>
+          <w:rFonts w:cstheme="minorHAnsi"/>
+          <w:b/>
+          <w:sz w:val="24"/>
+          <w:szCs w:val="24"/>
+        </w:rPr>
+      </w:pPr>
+      <w:r>
+        <w:rPr>
+          <w:rFonts w:cstheme="minorHAnsi"/>
+          <w:b/>
+          <w:sz w:val="24"/>
+          <w:szCs w:val="24"/>
+        </w:rPr>
+        <w:drawing>
+          <wp:inline distT="0" distB="0" distL="0" distR="0" wp14:anchorId="13EE1109" wp14:editId="1B5653A4">
+            <wp:extent cx="5731510" cy="1874375"/>
+            <wp:effectExtent l="0" t="0" r="2540" b="0"/>
+            <wp:docPr id="8" name="Picture 8"/>
+            <wp:cNvGraphicFramePr>
+              <a:graphicFrameLocks xmlns:a="http://schemas.openxmlformats.org/drawingml/2006/main" noChangeAspect="1"/>
+            </wp:cNvGraphicFramePr>
+            <a:graphic xmlns:a="http://schemas.openxmlformats.org/drawingml/2006/main">
+              <a:graphicData uri="http://schemas.openxmlformats.org/drawingml/2006/picture">
+                <pic:pic xmlns:pic="http://schemas.openxmlformats.org/drawingml/2006/picture">
+                  <pic:nvPicPr>
+                    <pic:cNvPr id="0" name=""/>
+                    <pic:cNvPicPr/>
+                  </pic:nvPicPr>
+                  <pic:blipFill>
+                    <a:blip r:embed="rId11"/>
+                    <a:stretch>
+                      <a:fillRect/>
+                    </a:stretch>
+                  </pic:blipFill>
+                  <pic:spPr>
+                    <a:xfrm>
+                      <a:off x="0" y="0"/>
+                      <a:ext cx="5731510" cy="1874375"/>
+                    </a:xfrm>
+                    <a:prstGeom prst="rect">
+                      <a:avLst/>
+                    </a:prstGeom>
+                  </pic:spPr>
+                </pic:pic>
+              </a:graphicData>
+            </a:graphic>
+          </wp:inline>
+        </w:drawing>
+      </w:r>
+      <w:r>
+        <w:rPr>
+          <w:rFonts w:cstheme="minorHAnsi"/>
+          <w:b/>
+          <w:sz w:val="24"/>
+          <w:szCs w:val="24"/>
+        </w:rPr>
+        <w:t xml:space="preserve"> </w:t>
+      </w:r>
+    </w:p>
+    <w:p>
+      <w:pPr>
+        <w:rPr>
+          <w:rFonts w:cstheme="minorHAnsi"/>
+          <w:b/>
+          <w:sz w:val="24"/>
+          <w:szCs w:val="24"/>
+        </w:rPr>
+      </w:pPr>
+      <w:r>
+        <w:rPr>
+          <w:rFonts w:cstheme="minorHAnsi"/>
+          <w:b/>
+          <w:sz w:val="24"/>
+          <w:szCs w:val="24"/>
+        </w:rPr>
+        <w:t xml:space="preserve">17. </w:t>
+      </w:r>
+      <w:r>
+        <w:rPr>
+          <w:rFonts w:cstheme="minorHAnsi"/>
+          <w:b/>
+          <w:sz w:val="24"/>
+          <w:szCs w:val="24"/>
+        </w:rPr>
+        <w:t>Why were Register and Login APIs returning 401 Unauthorized?</w:t>
+      </w:r>
+    </w:p>
+    <w:p>
+      <w:pPr>
+        <w:rPr>
+          <w:rFonts w:cstheme="minorHAnsi"/>
+          <w:b/>
+          <w:sz w:val="24"/>
+          <w:szCs w:val="24"/>
+        </w:rPr>
+      </w:pPr>
+      <w:r>
+        <w:rPr>
+          <w:rFonts w:cstheme="minorHAnsi"/>
+          <w:b/>
+          <w:sz w:val="24"/>
+          <w:szCs w:val="24"/>
+        </w:rPr>
+        <w:drawing>
+          <wp:inline distT="0" distB="0" distL="0" distR="0" wp14:anchorId="79081885" wp14:editId="514D30A2">
+            <wp:extent cx="5731510" cy="2459161"/>
+            <wp:effectExtent l="0" t="0" r="2540" b="0"/>
+            <wp:docPr id="9" name="Picture 9"/>
+            <wp:cNvGraphicFramePr>
+              <a:graphicFrameLocks xmlns:a="http://schemas.openxmlformats.org/drawingml/2006/main" noChangeAspect="1"/>
+            </wp:cNvGraphicFramePr>
+            <a:graphic xmlns:a="http://schemas.openxmlformats.org/drawingml/2006/main">
+              <a:graphicData uri="http://schemas.openxmlformats.org/drawingml/2006/picture">
+                <pic:pic xmlns:pic="http://schemas.openxmlformats.org/drawingml/2006/picture">
+                  <pic:nvPicPr>
+                    <pic:cNvPr id="0" name=""/>
+                    <pic:cNvPicPr/>
+                  </pic:nvPicPr>
+                  <pic:blipFill>
+                    <a:blip r:embed="rId12"/>
+                    <a:stretch>
+                      <a:fillRect/>
+                    </a:stretch>
+                  </pic:blipFill>
+                  <pic:spPr>
+                    <a:xfrm>
+                      <a:off x="0" y="0"/>
+                      <a:ext cx="5731510" cy="2459161"/>
+                    </a:xfrm>
+                    <a:prstGeom prst="rect">
+                      <a:avLst/>
+                    </a:prstGeom>
+                  </pic:spPr>
+                </pic:pic>
+              </a:graphicData>
+            </a:graphic>
+          </wp:inline>
+        </w:drawing>
+      </w:r>
+    </w:p>
+    <w:p>
+      <w:pPr>
+        <w:rPr>
+          <w:rFonts w:cstheme="minorHAnsi"/>
+          <w:b/>
+          <w:sz w:val="24"/>
+          <w:szCs w:val="24"/>
+        </w:rPr>
+      </w:pPr>
+    </w:p>
+    <w:p>
+      <w:pPr>
+        <w:rPr>
+          <w:rFonts w:cstheme="minorHAnsi"/>
+          <w:b/>
+          <w:sz w:val="24"/>
+          <w:szCs w:val="24"/>
+        </w:rPr>
+      </w:pPr>
+      <w:r>
+        <w:rPr>
+          <w:rFonts w:cstheme="minorHAnsi"/>
+          <w:b/>
+          <w:sz w:val="24"/>
+          <w:szCs w:val="24"/>
+        </w:rPr>
+        <w:t xml:space="preserve">18. </w:t>
+      </w:r>
+      <w:bookmarkStart w:id="0" w:name="_GoBack"/>
+      <w:bookmarkEnd w:id="0"/>
+    </w:p>
     <w:sectPr>
       <w:pgSz w:w="11906" w:h="16838"/>
       <w:pgMar w:top="1440" w:right="1440" w:bottom="1440" w:left="1440" w:header="708" w:footer="708" w:gutter="0"/>
@@ -6655,7 +7305,6 @@
   <w:style w:type="character" w:default="1" w:styleId="DefaultParagraphFont">
     <w:name w:val="Default Paragraph Font"/>
     <w:uiPriority w:val="1"/>
-    <w:semiHidden/>
     <w:unhideWhenUsed/>
   </w:style>
   <w:style w:type="table" w:default="1" w:styleId="TableNormal">
@@ -7057,7 +7706,6 @@
   <w:style w:type="character" w:default="1" w:styleId="DefaultParagraphFont">
     <w:name w:val="Default Paragraph Font"/>
     <w:uiPriority w:val="1"/>
-    <w:semiHidden/>
     <w:unhideWhenUsed/>
   </w:style>
   <w:style w:type="table" w:default="1" w:styleId="TableNormal">

</xml_diff>

<commit_message>
Sprint 5 - Order module implemented with place order, cart to order flow, and transaction handling
</commit_message>
<xml_diff>
--- a/Project_related_questions.docx
+++ b/Project_related_questions.docx
@@ -4535,12 +4535,23 @@
           <w:szCs w:val="24"/>
         </w:rPr>
       </w:pPr>
-      <w:r>
-        <w:rPr>
-          <w:rFonts w:asciiTheme="minorHAnsi" w:hAnsiTheme="minorHAnsi" w:cstheme="minorHAnsi"/>
-          <w:sz w:val="24"/>
-          <w:szCs w:val="24"/>
-        </w:rPr>
+    </w:p>
+    <w:p>
+      <w:pPr>
+        <w:pStyle w:val="Heading1"/>
+        <w:rPr>
+          <w:rFonts w:asciiTheme="minorHAnsi" w:hAnsiTheme="minorHAnsi" w:cstheme="minorHAnsi"/>
+          <w:sz w:val="24"/>
+          <w:szCs w:val="24"/>
+        </w:rPr>
+      </w:pPr>
+      <w:r>
+        <w:rPr>
+          <w:rFonts w:asciiTheme="minorHAnsi" w:hAnsiTheme="minorHAnsi" w:cstheme="minorHAnsi"/>
+          <w:sz w:val="24"/>
+          <w:szCs w:val="24"/>
+        </w:rPr>
+        <w:lastRenderedPageBreak/>
         <w:t xml:space="preserve">9. Why did you store the user in </w:t>
       </w:r>
       <w:proofErr w:type="spellStart"/>
@@ -4577,7 +4588,6 @@
           <w:sz w:val="24"/>
           <w:szCs w:val="24"/>
         </w:rPr>
-        <w:lastRenderedPageBreak/>
         <w:t>Answer</w:t>
       </w:r>
       <w:proofErr w:type="gramStart"/>
@@ -5503,6 +5513,7 @@
         <w:rPr>
           <w:rFonts w:cstheme="minorHAnsi"/>
         </w:rPr>
+        <w:lastRenderedPageBreak/>
         <w:br/>
       </w:r>
     </w:p>
@@ -5516,9 +5527,15 @@
       <w:r>
         <w:rPr>
           <w:rFonts w:asciiTheme="minorHAnsi" w:hAnsiTheme="minorHAnsi" w:cstheme="minorHAnsi"/>
-        </w:rPr>
-        <w:lastRenderedPageBreak/>
-        <w:t xml:space="preserve">12. </w:t>
+          <w:b/>
+        </w:rPr>
+        <w:t>12.</w:t>
+      </w:r>
+      <w:r>
+        <w:rPr>
+          <w:rFonts w:asciiTheme="minorHAnsi" w:hAnsiTheme="minorHAnsi" w:cstheme="minorHAnsi"/>
+        </w:rPr>
+        <w:t xml:space="preserve"> </w:t>
       </w:r>
       <w:r>
         <w:rPr>
@@ -5700,16 +5717,6 @@
         </w:rPr>
       </w:pPr>
     </w:p>
-    <w:p>
-      <w:pPr>
-        <w:pStyle w:val="NormalWeb"/>
-        <w:rPr>
-          <w:rFonts w:asciiTheme="minorHAnsi" w:hAnsiTheme="minorHAnsi" w:cstheme="minorHAnsi"/>
-          <w:sz w:val="20"/>
-          <w:szCs w:val="20"/>
-        </w:rPr>
-      </w:pPr>
-    </w:p>
     <w:p/>
     <w:p>
       <w:pPr>
@@ -5761,8 +5768,10 @@
         <w:rPr>
           <w:rFonts w:cstheme="minorHAnsi"/>
           <w:b/>
-          <w:sz w:val="24"/>
-          <w:szCs w:val="24"/>
+          <w:noProof/>
+          <w:sz w:val="24"/>
+          <w:szCs w:val="24"/>
+          <w:lang w:eastAsia="en-IN"/>
         </w:rPr>
         <w:drawing>
           <wp:inline distT="0" distB="0" distL="0" distR="0" wp14:anchorId="25C38E4E" wp14:editId="46C146EF">
@@ -5902,34 +5911,26 @@
           <w:sz w:val="24"/>
           <w:szCs w:val="24"/>
         </w:rPr>
-        <w:lastRenderedPageBreak/>
-        <w:t xml:space="preserve">14. </w:t>
-      </w:r>
-      <w:r>
-        <w:rPr>
-          <w:rFonts w:cstheme="minorHAnsi"/>
-          <w:b/>
-          <w:sz w:val="24"/>
-          <w:szCs w:val="24"/>
-        </w:rPr>
-        <w:t>Why was Delete API returning success even if the product did not exist?</w:t>
-      </w:r>
-    </w:p>
-    <w:p>
-      <w:pPr>
-        <w:rPr>
-          <w:rFonts w:cstheme="minorHAnsi"/>
-          <w:b/>
-          <w:sz w:val="24"/>
-          <w:szCs w:val="24"/>
-        </w:rPr>
-      </w:pPr>
-      <w:r>
-        <w:rPr>
-          <w:rFonts w:cstheme="minorHAnsi"/>
-          <w:b/>
-          <w:sz w:val="24"/>
-          <w:szCs w:val="24"/>
+        <w:t>14. Why was Delete API returning success even if the product did not exist?</w:t>
+      </w:r>
+    </w:p>
+    <w:p>
+      <w:pPr>
+        <w:rPr>
+          <w:rFonts w:cstheme="minorHAnsi"/>
+          <w:b/>
+          <w:sz w:val="24"/>
+          <w:szCs w:val="24"/>
+        </w:rPr>
+      </w:pPr>
+      <w:r>
+        <w:rPr>
+          <w:rFonts w:cstheme="minorHAnsi"/>
+          <w:b/>
+          <w:noProof/>
+          <w:sz w:val="24"/>
+          <w:szCs w:val="24"/>
+          <w:lang w:eastAsia="en-IN"/>
         </w:rPr>
         <w:drawing>
           <wp:inline distT="0" distB="0" distL="0" distR="0" wp14:anchorId="5AAEC981" wp14:editId="7255C629">
@@ -5994,16 +5995,7 @@
           <w:sz w:val="24"/>
           <w:szCs w:val="24"/>
         </w:rPr>
-        <w:t>15</w:t>
-      </w:r>
-      <w:r>
-        <w:rPr>
-          <w:rFonts w:cstheme="minorHAnsi"/>
-          <w:b/>
-          <w:sz w:val="24"/>
-          <w:szCs w:val="24"/>
-        </w:rPr>
-        <w:t xml:space="preserve">. Why was </w:t>
+        <w:t xml:space="preserve">15. Why was </w:t>
       </w:r>
       <w:r>
         <w:rPr>
@@ -6038,8 +6030,10 @@
         <w:rPr>
           <w:rFonts w:cstheme="minorHAnsi"/>
           <w:b/>
-          <w:sz w:val="24"/>
-          <w:szCs w:val="24"/>
+          <w:noProof/>
+          <w:sz w:val="24"/>
+          <w:szCs w:val="24"/>
+          <w:lang w:eastAsia="en-IN"/>
         </w:rPr>
         <w:drawing>
           <wp:inline distT="0" distB="0" distL="0" distR="0" wp14:anchorId="7E4A29C7" wp14:editId="5367DFBF">
@@ -6164,7 +6158,6 @@
           <w:sz w:val="24"/>
           <w:szCs w:val="24"/>
         </w:rPr>
-        <w:lastRenderedPageBreak/>
         <w:t xml:space="preserve">16. Why was the Add Product API returning 403 </w:t>
       </w:r>
       <w:proofErr w:type="gramStart"/>
@@ -6201,8 +6194,10 @@
         <w:rPr>
           <w:rFonts w:cstheme="minorHAnsi"/>
           <w:b/>
-          <w:sz w:val="24"/>
-          <w:szCs w:val="24"/>
+          <w:noProof/>
+          <w:sz w:val="24"/>
+          <w:szCs w:val="24"/>
+          <w:lang w:eastAsia="en-IN"/>
         </w:rPr>
         <w:drawing>
           <wp:inline distT="0" distB="0" distL="0" distR="0" wp14:anchorId="13EE1109" wp14:editId="1B5653A4">
@@ -6266,33 +6261,26 @@
           <w:sz w:val="24"/>
           <w:szCs w:val="24"/>
         </w:rPr>
-        <w:t xml:space="preserve">17. </w:t>
-      </w:r>
-      <w:r>
-        <w:rPr>
-          <w:rFonts w:cstheme="minorHAnsi"/>
-          <w:b/>
-          <w:sz w:val="24"/>
-          <w:szCs w:val="24"/>
-        </w:rPr>
-        <w:t>Why were Register and Login APIs returning 401 Unauthorized?</w:t>
-      </w:r>
-    </w:p>
-    <w:p>
-      <w:pPr>
-        <w:rPr>
-          <w:rFonts w:cstheme="minorHAnsi"/>
-          <w:b/>
-          <w:sz w:val="24"/>
-          <w:szCs w:val="24"/>
-        </w:rPr>
-      </w:pPr>
-      <w:r>
-        <w:rPr>
-          <w:rFonts w:cstheme="minorHAnsi"/>
-          <w:b/>
-          <w:sz w:val="24"/>
-          <w:szCs w:val="24"/>
+        <w:t>17. Why were Register and Login APIs returning 401 Unauthorized?</w:t>
+      </w:r>
+    </w:p>
+    <w:p>
+      <w:pPr>
+        <w:rPr>
+          <w:rFonts w:cstheme="minorHAnsi"/>
+          <w:b/>
+          <w:sz w:val="24"/>
+          <w:szCs w:val="24"/>
+        </w:rPr>
+      </w:pPr>
+      <w:r>
+        <w:rPr>
+          <w:rFonts w:cstheme="minorHAnsi"/>
+          <w:b/>
+          <w:noProof/>
+          <w:sz w:val="24"/>
+          <w:szCs w:val="24"/>
+          <w:lang w:eastAsia="en-IN"/>
         </w:rPr>
         <w:drawing>
           <wp:inline distT="0" distB="0" distL="0" distR="0" wp14:anchorId="79081885" wp14:editId="514D30A2">
@@ -6358,6 +6346,559 @@
           <w:szCs w:val="24"/>
         </w:rPr>
         <w:t xml:space="preserve">18. </w:t>
+      </w:r>
+      <w:r>
+        <w:rPr>
+          <w:rFonts w:cstheme="minorHAnsi"/>
+          <w:b/>
+          <w:sz w:val="24"/>
+          <w:szCs w:val="24"/>
+        </w:rPr>
+        <w:t>Why did your PUT API return 415 Unsupported Media Type?</w:t>
+      </w:r>
+    </w:p>
+    <w:p>
+      <w:pPr>
+        <w:rPr>
+          <w:rFonts w:cstheme="minorHAnsi"/>
+          <w:b/>
+          <w:sz w:val="24"/>
+          <w:szCs w:val="24"/>
+        </w:rPr>
+      </w:pPr>
+      <w:r>
+        <w:rPr>
+          <w:rFonts w:cstheme="minorHAnsi"/>
+          <w:b/>
+          <w:noProof/>
+          <w:sz w:val="24"/>
+          <w:szCs w:val="24"/>
+          <w:lang w:eastAsia="en-IN"/>
+        </w:rPr>
+        <w:drawing>
+          <wp:inline distT="0" distB="0" distL="0" distR="0" wp14:anchorId="0EA12848" wp14:editId="5792FD3D">
+            <wp:extent cx="5639289" cy="2286198"/>
+            <wp:effectExtent l="0" t="0" r="0" b="0"/>
+            <wp:docPr id="4" name="Picture 4"/>
+            <wp:cNvGraphicFramePr>
+              <a:graphicFrameLocks xmlns:a="http://schemas.openxmlformats.org/drawingml/2006/main" noChangeAspect="1"/>
+            </wp:cNvGraphicFramePr>
+            <a:graphic xmlns:a="http://schemas.openxmlformats.org/drawingml/2006/main">
+              <a:graphicData uri="http://schemas.openxmlformats.org/drawingml/2006/picture">
+                <pic:pic xmlns:pic="http://schemas.openxmlformats.org/drawingml/2006/picture">
+                  <pic:nvPicPr>
+                    <pic:cNvPr id="0" name=""/>
+                    <pic:cNvPicPr/>
+                  </pic:nvPicPr>
+                  <pic:blipFill>
+                    <a:blip r:embed="rId13"/>
+                    <a:stretch>
+                      <a:fillRect/>
+                    </a:stretch>
+                  </pic:blipFill>
+                  <pic:spPr>
+                    <a:xfrm>
+                      <a:off x="0" y="0"/>
+                      <a:ext cx="5639289" cy="2286198"/>
+                    </a:xfrm>
+                    <a:prstGeom prst="rect">
+                      <a:avLst/>
+                    </a:prstGeom>
+                  </pic:spPr>
+                </pic:pic>
+              </a:graphicData>
+            </a:graphic>
+          </wp:inline>
+        </w:drawing>
+      </w:r>
+    </w:p>
+    <w:p>
+      <w:pPr>
+        <w:rPr>
+          <w:rFonts w:cstheme="minorHAnsi"/>
+          <w:b/>
+          <w:sz w:val="24"/>
+          <w:szCs w:val="24"/>
+        </w:rPr>
+      </w:pPr>
+      <w:r>
+        <w:rPr>
+          <w:rFonts w:cstheme="minorHAnsi"/>
+          <w:b/>
+          <w:sz w:val="24"/>
+          <w:szCs w:val="24"/>
+        </w:rPr>
+        <w:lastRenderedPageBreak/>
+        <w:t xml:space="preserve">19. </w:t>
+      </w:r>
+      <w:r>
+        <w:rPr>
+          <w:rFonts w:cstheme="minorHAnsi"/>
+          <w:b/>
+          <w:sz w:val="24"/>
+          <w:szCs w:val="24"/>
+        </w:rPr>
+        <w:t>Why were duplicate products getting added to cart?</w:t>
+      </w:r>
+    </w:p>
+    <w:p>
+      <w:pPr>
+        <w:rPr>
+          <w:rFonts w:cstheme="minorHAnsi"/>
+          <w:b/>
+          <w:sz w:val="24"/>
+          <w:szCs w:val="24"/>
+        </w:rPr>
+      </w:pPr>
+      <w:r>
+        <w:rPr>
+          <w:rFonts w:cstheme="minorHAnsi"/>
+          <w:b/>
+          <w:sz w:val="24"/>
+          <w:szCs w:val="24"/>
+        </w:rPr>
+        <w:drawing>
+          <wp:inline distT="0" distB="0" distL="0" distR="0" wp14:anchorId="5A98FD23" wp14:editId="77496079">
+            <wp:extent cx="5677392" cy="2987299"/>
+            <wp:effectExtent l="0" t="0" r="0" b="3810"/>
+            <wp:docPr id="7" name="Picture 7"/>
+            <wp:cNvGraphicFramePr>
+              <a:graphicFrameLocks xmlns:a="http://schemas.openxmlformats.org/drawingml/2006/main" noChangeAspect="1"/>
+            </wp:cNvGraphicFramePr>
+            <a:graphic xmlns:a="http://schemas.openxmlformats.org/drawingml/2006/main">
+              <a:graphicData uri="http://schemas.openxmlformats.org/drawingml/2006/picture">
+                <pic:pic xmlns:pic="http://schemas.openxmlformats.org/drawingml/2006/picture">
+                  <pic:nvPicPr>
+                    <pic:cNvPr id="0" name=""/>
+                    <pic:cNvPicPr/>
+                  </pic:nvPicPr>
+                  <pic:blipFill>
+                    <a:blip r:embed="rId14"/>
+                    <a:stretch>
+                      <a:fillRect/>
+                    </a:stretch>
+                  </pic:blipFill>
+                  <pic:spPr>
+                    <a:xfrm>
+                      <a:off x="0" y="0"/>
+                      <a:ext cx="5677392" cy="2987299"/>
+                    </a:xfrm>
+                    <a:prstGeom prst="rect">
+                      <a:avLst/>
+                    </a:prstGeom>
+                  </pic:spPr>
+                </pic:pic>
+              </a:graphicData>
+            </a:graphic>
+          </wp:inline>
+        </w:drawing>
+      </w:r>
+    </w:p>
+    <w:p>
+      <w:pPr>
+        <w:rPr>
+          <w:rFonts w:cstheme="minorHAnsi"/>
+          <w:b/>
+          <w:sz w:val="24"/>
+          <w:szCs w:val="24"/>
+        </w:rPr>
+      </w:pPr>
+    </w:p>
+    <w:p>
+      <w:pPr>
+        <w:rPr>
+          <w:rFonts w:cstheme="minorHAnsi"/>
+          <w:b/>
+          <w:sz w:val="24"/>
+          <w:szCs w:val="24"/>
+        </w:rPr>
+      </w:pPr>
+      <w:r>
+        <w:rPr>
+          <w:rFonts w:cstheme="minorHAnsi"/>
+          <w:b/>
+          <w:sz w:val="24"/>
+          <w:szCs w:val="24"/>
+        </w:rPr>
+        <w:t>20. How did you handle duplicate items in cart?</w:t>
+      </w:r>
+    </w:p>
+    <w:p>
+      <w:pPr>
+        <w:rPr>
+          <w:rFonts w:cstheme="minorHAnsi"/>
+          <w:b/>
+          <w:sz w:val="24"/>
+          <w:szCs w:val="24"/>
+        </w:rPr>
+      </w:pPr>
+      <w:r>
+        <w:rPr>
+          <w:rFonts w:cstheme="minorHAnsi"/>
+          <w:sz w:val="24"/>
+          <w:szCs w:val="24"/>
+        </w:rPr>
+        <w:t>I added logic to check if a product already exists in the cart using streams. If it exists, I updated the quantity instead of creating a new entry.</w:t>
+      </w:r>
+      <w:r>
+        <w:rPr>
+          <w:rFonts w:cstheme="minorHAnsi"/>
+          <w:sz w:val="24"/>
+          <w:szCs w:val="24"/>
+        </w:rPr>
+        <w:t xml:space="preserve"> </w:t>
+      </w:r>
+      <w:r>
+        <w:rPr>
+          <w:rFonts w:cstheme="minorHAnsi"/>
+          <w:sz w:val="24"/>
+          <w:szCs w:val="24"/>
+        </w:rPr>
+        <w:br/>
+      </w:r>
+      <w:r>
+        <w:rPr>
+          <w:rFonts w:cstheme="minorHAnsi"/>
+          <w:sz w:val="24"/>
+          <w:szCs w:val="24"/>
+        </w:rPr>
+        <w:br/>
+      </w:r>
+      <w:r>
+        <w:rPr>
+          <w:rFonts w:cstheme="minorHAnsi"/>
+          <w:b/>
+          <w:sz w:val="24"/>
+          <w:szCs w:val="24"/>
+        </w:rPr>
+        <w:t xml:space="preserve">21. Why did you get error for </w:t>
+      </w:r>
+      <w:proofErr w:type="spellStart"/>
+      <w:r>
+        <w:rPr>
+          <w:rFonts w:cstheme="minorHAnsi"/>
+          <w:b/>
+          <w:sz w:val="24"/>
+          <w:szCs w:val="24"/>
+        </w:rPr>
+        <w:t>findByUserId</w:t>
+      </w:r>
+      <w:proofErr w:type="spellEnd"/>
+      <w:r>
+        <w:rPr>
+          <w:rFonts w:cstheme="minorHAnsi"/>
+          <w:b/>
+          <w:sz w:val="24"/>
+          <w:szCs w:val="24"/>
+        </w:rPr>
+        <w:t>?</w:t>
+      </w:r>
+    </w:p>
+    <w:p>
+      <w:pPr>
+        <w:rPr>
+          <w:rFonts w:cstheme="minorHAnsi"/>
+          <w:sz w:val="24"/>
+          <w:szCs w:val="24"/>
+        </w:rPr>
+      </w:pPr>
+      <w:r>
+        <w:rPr>
+          <w:rFonts w:cstheme="minorHAnsi"/>
+          <w:sz w:val="24"/>
+          <w:szCs w:val="24"/>
+        </w:rPr>
+        <w:drawing>
+          <wp:inline distT="0" distB="0" distL="0" distR="0" wp14:anchorId="34FC9B77" wp14:editId="4C522DD0">
+            <wp:extent cx="5731510" cy="3249080"/>
+            <wp:effectExtent l="0" t="0" r="2540" b="8890"/>
+            <wp:docPr id="10" name="Picture 10"/>
+            <wp:cNvGraphicFramePr>
+              <a:graphicFrameLocks xmlns:a="http://schemas.openxmlformats.org/drawingml/2006/main" noChangeAspect="1"/>
+            </wp:cNvGraphicFramePr>
+            <a:graphic xmlns:a="http://schemas.openxmlformats.org/drawingml/2006/main">
+              <a:graphicData uri="http://schemas.openxmlformats.org/drawingml/2006/picture">
+                <pic:pic xmlns:pic="http://schemas.openxmlformats.org/drawingml/2006/picture">
+                  <pic:nvPicPr>
+                    <pic:cNvPr id="0" name=""/>
+                    <pic:cNvPicPr/>
+                  </pic:nvPicPr>
+                  <pic:blipFill>
+                    <a:blip r:embed="rId15"/>
+                    <a:stretch>
+                      <a:fillRect/>
+                    </a:stretch>
+                  </pic:blipFill>
+                  <pic:spPr>
+                    <a:xfrm>
+                      <a:off x="0" y="0"/>
+                      <a:ext cx="5731510" cy="3249080"/>
+                    </a:xfrm>
+                    <a:prstGeom prst="rect">
+                      <a:avLst/>
+                    </a:prstGeom>
+                  </pic:spPr>
+                </pic:pic>
+              </a:graphicData>
+            </a:graphic>
+          </wp:inline>
+        </w:drawing>
+      </w:r>
+    </w:p>
+    <w:p>
+      <w:pPr>
+        <w:rPr>
+          <w:rFonts w:cstheme="minorHAnsi"/>
+          <w:sz w:val="24"/>
+          <w:szCs w:val="24"/>
+        </w:rPr>
+      </w:pPr>
+    </w:p>
+    <w:p>
+      <w:pPr>
+        <w:rPr>
+          <w:rFonts w:cstheme="minorHAnsi"/>
+          <w:sz w:val="24"/>
+          <w:szCs w:val="24"/>
+        </w:rPr>
+      </w:pPr>
+      <w:r>
+        <w:rPr>
+          <w:rFonts w:cstheme="minorHAnsi"/>
+          <w:b/>
+          <w:sz w:val="24"/>
+          <w:szCs w:val="24"/>
+        </w:rPr>
+        <w:lastRenderedPageBreak/>
+        <w:t>22. Why is cascade = ALL important?</w:t>
+      </w:r>
+      <w:r>
+        <w:rPr>
+          <w:rFonts w:cstheme="minorHAnsi"/>
+          <w:b/>
+          <w:sz w:val="24"/>
+          <w:szCs w:val="24"/>
+        </w:rPr>
+        <w:br/>
+      </w:r>
+      <w:r>
+        <w:rPr>
+          <w:rFonts w:cstheme="minorHAnsi"/>
+          <w:sz w:val="24"/>
+          <w:szCs w:val="24"/>
+        </w:rPr>
+        <w:t>Without cascade, child entities (</w:t>
+      </w:r>
+      <w:proofErr w:type="spellStart"/>
+      <w:r>
+        <w:rPr>
+          <w:rFonts w:cstheme="minorHAnsi"/>
+          <w:sz w:val="24"/>
+          <w:szCs w:val="24"/>
+        </w:rPr>
+        <w:t>OrderItems</w:t>
+      </w:r>
+      <w:proofErr w:type="spellEnd"/>
+      <w:r>
+        <w:rPr>
+          <w:rFonts w:cstheme="minorHAnsi"/>
+          <w:sz w:val="24"/>
+          <w:szCs w:val="24"/>
+        </w:rPr>
+        <w:t>) won’t be saved automatically when saving order.</w:t>
+      </w:r>
+    </w:p>
+    <w:p>
+      <w:pPr>
+        <w:rPr>
+          <w:rFonts w:cstheme="minorHAnsi"/>
+          <w:sz w:val="24"/>
+          <w:szCs w:val="24"/>
+        </w:rPr>
+      </w:pPr>
+    </w:p>
+    <w:p>
+      <w:pPr>
+        <w:rPr>
+          <w:rFonts w:cstheme="minorHAnsi"/>
+          <w:sz w:val="24"/>
+          <w:szCs w:val="24"/>
+        </w:rPr>
+      </w:pPr>
+      <w:r>
+        <w:rPr>
+          <w:rFonts w:cstheme="minorHAnsi"/>
+          <w:b/>
+          <w:sz w:val="24"/>
+          <w:szCs w:val="24"/>
+        </w:rPr>
+        <w:t>23. Why did you use @</w:t>
+      </w:r>
+      <w:proofErr w:type="spellStart"/>
+      <w:r>
+        <w:rPr>
+          <w:rFonts w:cstheme="minorHAnsi"/>
+          <w:b/>
+          <w:sz w:val="24"/>
+          <w:szCs w:val="24"/>
+        </w:rPr>
+        <w:t>Transactonal</w:t>
+      </w:r>
+      <w:proofErr w:type="spellEnd"/>
+      <w:r>
+        <w:rPr>
+          <w:rFonts w:cstheme="minorHAnsi"/>
+          <w:b/>
+          <w:sz w:val="24"/>
+          <w:szCs w:val="24"/>
+        </w:rPr>
+        <w:t>?</w:t>
+      </w:r>
+      <w:r>
+        <w:rPr>
+          <w:rFonts w:cstheme="minorHAnsi"/>
+          <w:b/>
+          <w:sz w:val="24"/>
+          <w:szCs w:val="24"/>
+        </w:rPr>
+        <w:br/>
+      </w:r>
+      <w:r>
+        <w:rPr>
+          <w:rFonts w:cstheme="minorHAnsi"/>
+          <w:sz w:val="24"/>
+          <w:szCs w:val="24"/>
+        </w:rPr>
+        <w:t>To ensure all operations (order creation + cart clearing) execute in a single transaction. If anything fails, everything rolls back.</w:t>
+      </w:r>
+    </w:p>
+    <w:p>
+      <w:pPr>
+        <w:rPr>
+          <w:rFonts w:cstheme="minorHAnsi"/>
+          <w:b/>
+          <w:sz w:val="24"/>
+          <w:szCs w:val="24"/>
+        </w:rPr>
+      </w:pPr>
+      <w:r>
+        <w:rPr>
+          <w:rFonts w:cstheme="minorHAnsi"/>
+          <w:b/>
+          <w:sz w:val="24"/>
+          <w:szCs w:val="24"/>
+        </w:rPr>
+        <w:t>NOTE</w:t>
+      </w:r>
+      <w:proofErr w:type="gramStart"/>
+      <w:r>
+        <w:rPr>
+          <w:rFonts w:cstheme="minorHAnsi"/>
+          <w:b/>
+          <w:sz w:val="24"/>
+          <w:szCs w:val="24"/>
+        </w:rPr>
+        <w:t>:</w:t>
+      </w:r>
+      <w:r>
+        <w:rPr>
+          <w:rFonts w:cstheme="minorHAnsi"/>
+          <w:b/>
+          <w:sz w:val="24"/>
+          <w:szCs w:val="24"/>
+        </w:rPr>
+        <w:t>-</w:t>
+      </w:r>
+      <w:proofErr w:type="gramEnd"/>
+      <w:r>
+        <w:rPr>
+          <w:rFonts w:cstheme="minorHAnsi"/>
+          <w:b/>
+          <w:sz w:val="24"/>
+          <w:szCs w:val="24"/>
+        </w:rPr>
+        <w:t xml:space="preserve"> Maintain data consistency in multi-step operations.</w:t>
+      </w:r>
+    </w:p>
+    <w:p>
+      <w:pPr>
+        <w:rPr>
+          <w:rFonts w:cstheme="minorHAnsi"/>
+          <w:b/>
+          <w:sz w:val="24"/>
+          <w:szCs w:val="24"/>
+        </w:rPr>
+      </w:pPr>
+    </w:p>
+    <w:p>
+      <w:pPr>
+        <w:rPr>
+          <w:rFonts w:cstheme="minorHAnsi"/>
+          <w:b/>
+          <w:sz w:val="24"/>
+          <w:szCs w:val="24"/>
+        </w:rPr>
+      </w:pPr>
+      <w:r>
+        <w:rPr>
+          <w:rFonts w:cstheme="minorHAnsi"/>
+          <w:b/>
+          <w:sz w:val="24"/>
+          <w:szCs w:val="24"/>
+        </w:rPr>
+        <w:t>24. Why was cart not clearing after order?</w:t>
+      </w:r>
+      <w:r>
+        <w:rPr>
+          <w:rFonts w:cstheme="minorHAnsi"/>
+          <w:b/>
+          <w:sz w:val="24"/>
+          <w:szCs w:val="24"/>
+        </w:rPr>
+        <w:br/>
+      </w:r>
+      <w:r>
+        <w:rPr>
+          <w:rFonts w:cstheme="minorHAnsi"/>
+          <w:b/>
+          <w:sz w:val="24"/>
+          <w:szCs w:val="24"/>
+        </w:rPr>
+        <w:drawing>
+          <wp:inline distT="0" distB="0" distL="0" distR="0" wp14:anchorId="26742783" wp14:editId="51F8E957">
+            <wp:extent cx="4618120" cy="2072820"/>
+            <wp:effectExtent l="0" t="0" r="0" b="3810"/>
+            <wp:docPr id="11" name="Picture 11"/>
+            <wp:cNvGraphicFramePr>
+              <a:graphicFrameLocks xmlns:a="http://schemas.openxmlformats.org/drawingml/2006/main" noChangeAspect="1"/>
+            </wp:cNvGraphicFramePr>
+            <a:graphic xmlns:a="http://schemas.openxmlformats.org/drawingml/2006/main">
+              <a:graphicData uri="http://schemas.openxmlformats.org/drawingml/2006/picture">
+                <pic:pic xmlns:pic="http://schemas.openxmlformats.org/drawingml/2006/picture">
+                  <pic:nvPicPr>
+                    <pic:cNvPr id="0" name=""/>
+                    <pic:cNvPicPr/>
+                  </pic:nvPicPr>
+                  <pic:blipFill>
+                    <a:blip r:embed="rId16"/>
+                    <a:stretch>
+                      <a:fillRect/>
+                    </a:stretch>
+                  </pic:blipFill>
+                  <pic:spPr>
+                    <a:xfrm>
+                      <a:off x="0" y="0"/>
+                      <a:ext cx="4618120" cy="2072820"/>
+                    </a:xfrm>
+                    <a:prstGeom prst="rect">
+                      <a:avLst/>
+                    </a:prstGeom>
+                  </pic:spPr>
+                </pic:pic>
+              </a:graphicData>
+            </a:graphic>
+          </wp:inline>
+        </w:drawing>
       </w:r>
       <w:bookmarkStart w:id="0" w:name="_GoBack"/>
       <w:bookmarkEnd w:id="0"/>
@@ -7305,6 +7846,7 @@
   <w:style w:type="character" w:default="1" w:styleId="DefaultParagraphFont">
     <w:name w:val="Default Paragraph Font"/>
     <w:uiPriority w:val="1"/>
+    <w:semiHidden/>
     <w:unhideWhenUsed/>
   </w:style>
   <w:style w:type="table" w:default="1" w:styleId="TableNormal">
@@ -7706,6 +8248,7 @@
   <w:style w:type="character" w:default="1" w:styleId="DefaultParagraphFont">
     <w:name w:val="Default Paragraph Font"/>
     <w:uiPriority w:val="1"/>
+    <w:semiHidden/>
     <w:unhideWhenUsed/>
   </w:style>
   <w:style w:type="table" w:default="1" w:styleId="TableNormal">

</xml_diff>

<commit_message>
Frontend completed - auth, cart, checkout UI
</commit_message>
<xml_diff>
--- a/Project_related_questions.docx
+++ b/Project_related_questions.docx
@@ -6899,6 +6899,35 @@
             </a:graphic>
           </wp:inline>
         </w:drawing>
+      </w:r>
+    </w:p>
+    <w:p>
+      <w:pPr>
+        <w:rPr>
+          <w:rFonts w:cstheme="minorHAnsi"/>
+          <w:b/>
+          <w:sz w:val="24"/>
+          <w:szCs w:val="24"/>
+        </w:rPr>
+      </w:pPr>
+    </w:p>
+    <w:p>
+      <w:pPr>
+        <w:rPr>
+          <w:rFonts w:cstheme="minorHAnsi"/>
+          <w:b/>
+          <w:sz w:val="24"/>
+          <w:szCs w:val="24"/>
+        </w:rPr>
+      </w:pPr>
+      <w:r>
+        <w:rPr>
+          <w:rFonts w:cstheme="minorHAnsi"/>
+          <w:b/>
+          <w:sz w:val="24"/>
+          <w:szCs w:val="24"/>
+        </w:rPr>
+        <w:t xml:space="preserve">25. </w:t>
       </w:r>
       <w:bookmarkStart w:id="0" w:name="_GoBack"/>
       <w:bookmarkEnd w:id="0"/>

</xml_diff>